<commit_message>
Review and streamline SDLC templates
</commit_message>
<xml_diff>
--- a/assets/templates/deployment/ci-cd-pipeline-documentation.docx
+++ b/assets/templates/deployment/ci-cd-pipeline-documentation.docx
@@ -517,547 +517,6 @@
         <w:keepNext/>
       </w:pPr>
       <w:r>
-        <w:t>Kiểm soát tài liệu</w:t>
-      </w:r>
-    </w:p>
-    <w:p>
-      <w:pPr>
-        <w:spacing w:before="160" w:after="80"/>
-      </w:pPr>
-      <w:r>
-        <w:rPr>
-          <w:rFonts w:ascii="Arial" w:hAnsi="Arial"/>
-          <w:b/>
-          <w:i w:val="0"/>
-          <w:color w:val="A71920"/>
-          <w:sz w:val="22"/>
-        </w:rPr>
-        <w:t>Revision History</w:t>
-      </w:r>
-    </w:p>
-    <w:tbl>
-      <w:tblPr>
-        <w:tblStyle w:val="TableGrid"/>
-        <w:tblW w:type="dxa" w:w="9026"/>
-        <w:jc w:val="left"/>
-        <w:tblLayout w:type="fixed"/>
-        <w:tblLook w:firstColumn="1" w:firstRow="1" w:lastColumn="0" w:lastRow="0" w:noHBand="0" w:noVBand="1" w:val="04A0"/>
-        <w:tblInd w:w="120" w:type="dxa"/>
-      </w:tblPr>
-      <w:tblGrid>
-        <w:gridCol w:w="1083"/>
-        <w:gridCol w:w="1264"/>
-        <w:gridCol w:w="2076"/>
-        <w:gridCol w:w="2979"/>
-        <w:gridCol w:w="1624"/>
-      </w:tblGrid>
-      <w:tr>
-        <w:trPr>
-          <w:tblHeader w:val="true"/>
-        </w:trPr>
-        <w:tc>
-          <w:tcPr>
-            <w:tcW w:type="dxa" w:w="1083"/>
-            <w:tcMar>
-              <w:top w:w="80" w:type="dxa"/>
-              <w:start w:w="120" w:type="dxa"/>
-              <w:bottom w:w="80" w:type="dxa"/>
-              <w:end w:w="120" w:type="dxa"/>
-            </w:tcMar>
-            <w:shd w:fill="DA2128"/>
-            <w:vAlign w:val="center"/>
-          </w:tcPr>
-          <w:p>
-            <w:pPr>
-              <w:spacing w:after="0" w:line="259" w:lineRule="auto"/>
-            </w:pPr>
-            <w:r/>
-            <w:r>
-              <w:rPr>
-                <w:rFonts w:ascii="Arial" w:hAnsi="Arial"/>
-                <w:b/>
-                <w:i w:val="0"/>
-                <w:color w:val="FFFFFF"/>
-                <w:sz w:val="17"/>
-              </w:rPr>
-              <w:t>Version</w:t>
-            </w:r>
-          </w:p>
-        </w:tc>
-        <w:tc>
-          <w:tcPr>
-            <w:tcW w:type="dxa" w:w="1264"/>
-            <w:tcMar>
-              <w:top w:w="80" w:type="dxa"/>
-              <w:start w:w="120" w:type="dxa"/>
-              <w:bottom w:w="80" w:type="dxa"/>
-              <w:end w:w="120" w:type="dxa"/>
-            </w:tcMar>
-            <w:shd w:fill="DA2128"/>
-            <w:vAlign w:val="center"/>
-          </w:tcPr>
-          <w:p>
-            <w:pPr>
-              <w:spacing w:after="0" w:line="259" w:lineRule="auto"/>
-            </w:pPr>
-            <w:r/>
-            <w:r>
-              <w:rPr>
-                <w:rFonts w:ascii="Arial" w:hAnsi="Arial"/>
-                <w:b/>
-                <w:i w:val="0"/>
-                <w:color w:val="FFFFFF"/>
-                <w:sz w:val="17"/>
-              </w:rPr>
-              <w:t>Ngày</w:t>
-            </w:r>
-          </w:p>
-        </w:tc>
-        <w:tc>
-          <w:tcPr>
-            <w:tcW w:type="dxa" w:w="2076"/>
-            <w:tcMar>
-              <w:top w:w="80" w:type="dxa"/>
-              <w:start w:w="120" w:type="dxa"/>
-              <w:bottom w:w="80" w:type="dxa"/>
-              <w:end w:w="120" w:type="dxa"/>
-            </w:tcMar>
-            <w:shd w:fill="DA2128"/>
-            <w:vAlign w:val="center"/>
-          </w:tcPr>
-          <w:p>
-            <w:pPr>
-              <w:spacing w:after="0" w:line="259" w:lineRule="auto"/>
-            </w:pPr>
-            <w:r/>
-            <w:r>
-              <w:rPr>
-                <w:rFonts w:ascii="Arial" w:hAnsi="Arial"/>
-                <w:b/>
-                <w:i w:val="0"/>
-                <w:color w:val="FFFFFF"/>
-                <w:sz w:val="17"/>
-              </w:rPr>
-              <w:t>Người sửa (PIC)</w:t>
-            </w:r>
-          </w:p>
-        </w:tc>
-        <w:tc>
-          <w:tcPr>
-            <w:tcW w:type="dxa" w:w="2979"/>
-            <w:tcMar>
-              <w:top w:w="80" w:type="dxa"/>
-              <w:start w:w="120" w:type="dxa"/>
-              <w:bottom w:w="80" w:type="dxa"/>
-              <w:end w:w="120" w:type="dxa"/>
-            </w:tcMar>
-            <w:shd w:fill="DA2128"/>
-            <w:vAlign w:val="center"/>
-          </w:tcPr>
-          <w:p>
-            <w:pPr>
-              <w:spacing w:after="0" w:line="259" w:lineRule="auto"/>
-            </w:pPr>
-            <w:r/>
-            <w:r>
-              <w:rPr>
-                <w:rFonts w:ascii="Arial" w:hAnsi="Arial"/>
-                <w:b/>
-                <w:i w:val="0"/>
-                <w:color w:val="FFFFFF"/>
-                <w:sz w:val="17"/>
-              </w:rPr>
-              <w:t>Nội dung thay đổi</w:t>
-            </w:r>
-          </w:p>
-        </w:tc>
-        <w:tc>
-          <w:tcPr>
-            <w:tcW w:type="dxa" w:w="1624"/>
-            <w:tcMar>
-              <w:top w:w="80" w:type="dxa"/>
-              <w:start w:w="120" w:type="dxa"/>
-              <w:bottom w:w="80" w:type="dxa"/>
-              <w:end w:w="120" w:type="dxa"/>
-            </w:tcMar>
-            <w:shd w:fill="DA2128"/>
-            <w:vAlign w:val="center"/>
-          </w:tcPr>
-          <w:p>
-            <w:pPr>
-              <w:spacing w:after="0" w:line="259" w:lineRule="auto"/>
-            </w:pPr>
-            <w:r/>
-            <w:r>
-              <w:rPr>
-                <w:rFonts w:ascii="Arial" w:hAnsi="Arial"/>
-                <w:b/>
-                <w:i w:val="0"/>
-                <w:color w:val="FFFFFF"/>
-                <w:sz w:val="17"/>
-              </w:rPr>
-              <w:t>Người duyệt</w:t>
-            </w:r>
-          </w:p>
-        </w:tc>
-      </w:tr>
-      <w:tr>
-        <w:tc>
-          <w:tcPr>
-            <w:tcW w:type="dxa" w:w="1083"/>
-            <w:tcMar>
-              <w:top w:w="80" w:type="dxa"/>
-              <w:start w:w="120" w:type="dxa"/>
-              <w:bottom w:w="80" w:type="dxa"/>
-              <w:end w:w="120" w:type="dxa"/>
-            </w:tcMar>
-            <w:vAlign w:val="center"/>
-          </w:tcPr>
-          <w:p>
-            <w:pPr>
-              <w:spacing w:after="0" w:line="259" w:lineRule="auto"/>
-            </w:pPr>
-            <w:r/>
-            <w:r>
-              <w:rPr>
-                <w:rFonts w:ascii="Arial" w:hAnsi="Arial"/>
-                <w:b w:val="0"/>
-                <w:i w:val="0"/>
-                <w:color w:val="25324A"/>
-                <w:sz w:val="17"/>
-              </w:rPr>
-              <w:t>1.0</w:t>
-            </w:r>
-          </w:p>
-        </w:tc>
-        <w:tc>
-          <w:tcPr>
-            <w:tcW w:type="dxa" w:w="1264"/>
-            <w:tcMar>
-              <w:top w:w="80" w:type="dxa"/>
-              <w:start w:w="120" w:type="dxa"/>
-              <w:bottom w:w="80" w:type="dxa"/>
-              <w:end w:w="120" w:type="dxa"/>
-            </w:tcMar>
-            <w:vAlign w:val="center"/>
-          </w:tcPr>
-          <w:p>
-            <w:pPr>
-              <w:spacing w:after="0" w:line="259" w:lineRule="auto"/>
-            </w:pPr>
-            <w:r/>
-            <w:r>
-              <w:rPr>
-                <w:rFonts w:ascii="Arial" w:hAnsi="Arial"/>
-                <w:b w:val="0"/>
-                <w:i w:val="0"/>
-                <w:color w:val="25324A"/>
-                <w:sz w:val="17"/>
-              </w:rPr>
-              <w:t>[ĐIỀN]</w:t>
-            </w:r>
-          </w:p>
-        </w:tc>
-        <w:tc>
-          <w:tcPr>
-            <w:tcW w:type="dxa" w:w="2076"/>
-            <w:tcMar>
-              <w:top w:w="80" w:type="dxa"/>
-              <w:start w:w="120" w:type="dxa"/>
-              <w:bottom w:w="80" w:type="dxa"/>
-              <w:end w:w="120" w:type="dxa"/>
-            </w:tcMar>
-            <w:vAlign w:val="center"/>
-          </w:tcPr>
-          <w:p>
-            <w:pPr>
-              <w:spacing w:after="0" w:line="259" w:lineRule="auto"/>
-            </w:pPr>
-            <w:r/>
-            <w:r>
-              <w:rPr>
-                <w:rFonts w:ascii="Arial" w:hAnsi="Arial"/>
-                <w:b w:val="0"/>
-                <w:i w:val="0"/>
-                <w:color w:val="25324A"/>
-                <w:sz w:val="17"/>
-              </w:rPr>
-              <w:t>DevOps Engineer</w:t>
-            </w:r>
-          </w:p>
-        </w:tc>
-        <w:tc>
-          <w:tcPr>
-            <w:tcW w:type="dxa" w:w="2979"/>
-            <w:tcMar>
-              <w:top w:w="80" w:type="dxa"/>
-              <w:start w:w="120" w:type="dxa"/>
-              <w:bottom w:w="80" w:type="dxa"/>
-              <w:end w:w="120" w:type="dxa"/>
-            </w:tcMar>
-            <w:vAlign w:val="center"/>
-          </w:tcPr>
-          <w:p>
-            <w:pPr>
-              <w:spacing w:after="0" w:line="259" w:lineRule="auto"/>
-            </w:pPr>
-            <w:r/>
-            <w:r>
-              <w:rPr>
-                <w:rFonts w:ascii="Arial" w:hAnsi="Arial"/>
-                <w:b w:val="0"/>
-                <w:i w:val="0"/>
-                <w:color w:val="25324A"/>
-                <w:sz w:val="17"/>
-              </w:rPr>
-              <w:t>Bản template đầu tiên</w:t>
-            </w:r>
-          </w:p>
-        </w:tc>
-        <w:tc>
-          <w:tcPr>
-            <w:tcW w:type="dxa" w:w="1624"/>
-            <w:tcMar>
-              <w:top w:w="80" w:type="dxa"/>
-              <w:start w:w="120" w:type="dxa"/>
-              <w:bottom w:w="80" w:type="dxa"/>
-              <w:end w:w="120" w:type="dxa"/>
-            </w:tcMar>
-            <w:vAlign w:val="center"/>
-          </w:tcPr>
-          <w:p>
-            <w:pPr>
-              <w:spacing w:after="0" w:line="259" w:lineRule="auto"/>
-            </w:pPr>
-            <w:r/>
-            <w:r>
-              <w:rPr>
-                <w:rFonts w:ascii="Arial" w:hAnsi="Arial"/>
-                <w:b w:val="0"/>
-                <w:i w:val="0"/>
-                <w:color w:val="25324A"/>
-                <w:sz w:val="17"/>
-              </w:rPr>
-              <w:t>[ĐIỀN]</w:t>
-            </w:r>
-          </w:p>
-        </w:tc>
-      </w:tr>
-      <w:tr>
-        <w:tc>
-          <w:tcPr>
-            <w:tcW w:type="dxa" w:w="1083"/>
-            <w:tcMar>
-              <w:top w:w="80" w:type="dxa"/>
-              <w:start w:w="120" w:type="dxa"/>
-              <w:bottom w:w="80" w:type="dxa"/>
-              <w:end w:w="120" w:type="dxa"/>
-            </w:tcMar>
-            <w:shd w:fill="F4F6F8"/>
-            <w:vAlign w:val="center"/>
-          </w:tcPr>
-          <w:p>
-            <w:pPr>
-              <w:spacing w:after="0" w:line="259" w:lineRule="auto"/>
-            </w:pPr>
-            <w:r/>
-            <w:r>
-              <w:rPr>
-                <w:rFonts w:ascii="Arial" w:hAnsi="Arial"/>
-                <w:b w:val="0"/>
-                <w:i w:val="0"/>
-                <w:color w:val="667085"/>
-                <w:sz w:val="17"/>
-              </w:rPr>
-              <w:t>[ĐIỀN 2]</w:t>
-            </w:r>
-          </w:p>
-        </w:tc>
-        <w:tc>
-          <w:tcPr>
-            <w:tcW w:type="dxa" w:w="1264"/>
-            <w:tcMar>
-              <w:top w:w="80" w:type="dxa"/>
-              <w:start w:w="120" w:type="dxa"/>
-              <w:bottom w:w="80" w:type="dxa"/>
-              <w:end w:w="120" w:type="dxa"/>
-            </w:tcMar>
-            <w:shd w:fill="F4F6F8"/>
-            <w:vAlign w:val="center"/>
-          </w:tcPr>
-          <w:p>
-            <w:pPr>
-              <w:spacing w:after="0" w:line="259" w:lineRule="auto"/>
-            </w:pPr>
-            <w:r/>
-            <w:r>
-              <w:rPr>
-                <w:rFonts w:ascii="Arial" w:hAnsi="Arial"/>
-                <w:b w:val="0"/>
-                <w:i w:val="0"/>
-                <w:color w:val="667085"/>
-                <w:sz w:val="17"/>
-              </w:rPr>
-              <w:t>[ĐIỀN]</w:t>
-            </w:r>
-          </w:p>
-        </w:tc>
-        <w:tc>
-          <w:tcPr>
-            <w:tcW w:type="dxa" w:w="2076"/>
-            <w:tcMar>
-              <w:top w:w="80" w:type="dxa"/>
-              <w:start w:w="120" w:type="dxa"/>
-              <w:bottom w:w="80" w:type="dxa"/>
-              <w:end w:w="120" w:type="dxa"/>
-            </w:tcMar>
-            <w:shd w:fill="F4F6F8"/>
-            <w:vAlign w:val="center"/>
-          </w:tcPr>
-          <w:p>
-            <w:pPr>
-              <w:spacing w:after="0" w:line="259" w:lineRule="auto"/>
-            </w:pPr>
-            <w:r/>
-            <w:r>
-              <w:rPr>
-                <w:rFonts w:ascii="Arial" w:hAnsi="Arial"/>
-                <w:b w:val="0"/>
-                <w:i w:val="0"/>
-                <w:color w:val="667085"/>
-                <w:sz w:val="17"/>
-              </w:rPr>
-              <w:t>[ĐIỀN]</w:t>
-            </w:r>
-          </w:p>
-        </w:tc>
-        <w:tc>
-          <w:tcPr>
-            <w:tcW w:type="dxa" w:w="2979"/>
-            <w:tcMar>
-              <w:top w:w="80" w:type="dxa"/>
-              <w:start w:w="120" w:type="dxa"/>
-              <w:bottom w:w="80" w:type="dxa"/>
-              <w:end w:w="120" w:type="dxa"/>
-            </w:tcMar>
-            <w:shd w:fill="F4F6F8"/>
-            <w:vAlign w:val="center"/>
-          </w:tcPr>
-          <w:p>
-            <w:pPr>
-              <w:spacing w:after="0" w:line="259" w:lineRule="auto"/>
-            </w:pPr>
-            <w:r/>
-            <w:r>
-              <w:rPr>
-                <w:rFonts w:ascii="Arial" w:hAnsi="Arial"/>
-                <w:b w:val="0"/>
-                <w:i w:val="0"/>
-                <w:color w:val="667085"/>
-                <w:sz w:val="17"/>
-              </w:rPr>
-              <w:t>[ĐIỀN]</w:t>
-            </w:r>
-          </w:p>
-        </w:tc>
-        <w:tc>
-          <w:tcPr>
-            <w:tcW w:type="dxa" w:w="1624"/>
-            <w:tcMar>
-              <w:top w:w="80" w:type="dxa"/>
-              <w:start w:w="120" w:type="dxa"/>
-              <w:bottom w:w="80" w:type="dxa"/>
-              <w:end w:w="120" w:type="dxa"/>
-            </w:tcMar>
-            <w:shd w:fill="F4F6F8"/>
-            <w:vAlign w:val="center"/>
-          </w:tcPr>
-          <w:p>
-            <w:pPr>
-              <w:spacing w:after="0" w:line="259" w:lineRule="auto"/>
-            </w:pPr>
-            <w:r/>
-            <w:r>
-              <w:rPr>
-                <w:rFonts w:ascii="Arial" w:hAnsi="Arial"/>
-                <w:b w:val="0"/>
-                <w:i w:val="0"/>
-                <w:color w:val="667085"/>
-                <w:sz w:val="17"/>
-              </w:rPr>
-              <w:t>[ĐIỀN]</w:t>
-            </w:r>
-          </w:p>
-        </w:tc>
-      </w:tr>
-    </w:tbl>
-    <w:p>
-      <w:pPr>
-        <w:spacing w:after="40"/>
-      </w:pPr>
-    </w:p>
-    <w:p>
-      <w:pPr>
-        <w:pStyle w:val="Heading1"/>
-        <w:keepNext/>
-      </w:pPr>
-      <w:r>
-        <w:t>Mục lục</w:t>
-      </w:r>
-    </w:p>
-    <w:p>
-      <w:pPr>
-        <w:spacing w:after="160"/>
-      </w:pPr>
-      <w:r>
-        <w:fldChar w:fldCharType="begin"/>
-        <w:instrText xml:space="preserve">TOC \o "1-3" \h \z \u</w:instrText>
-        <w:fldChar w:fldCharType="separate"/>
-        <w:t>Mở tài liệu trong Word và chọn Update Field để cập nhật mục lục.</w:t>
-        <w:fldChar w:fldCharType="end"/>
-      </w:r>
-    </w:p>
-    <w:p>
-      <w:pPr>
-        <w:spacing w:before="80" w:after="160"/>
-        <w:ind w:left="180" w:right="180"/>
-        <w:shd w:fill="FDEDEE"/>
-        <w:pBdr>
-          <w:left w:val="single" w:sz="18" w:space="6" w:color="DA2128"/>
-        </w:pBdr>
-      </w:pPr>
-      <w:r>
-        <w:rPr>
-          <w:rFonts w:ascii="Arial" w:hAnsi="Arial"/>
-          <w:b/>
-          <w:i w:val="0"/>
-          <w:color w:val="A71920"/>
-          <w:sz w:val="21"/>
-        </w:rPr>
-        <w:t xml:space="preserve">Output yêu cầu: </w:t>
-      </w:r>
-      <w:r>
-        <w:rPr>
-          <w:rFonts w:ascii="Arial" w:hAnsi="Arial"/>
-          <w:b w:val="0"/>
-          <w:i w:val="0"/>
-          <w:color w:val="25324A"/>
-          <w:sz w:val="21"/>
-        </w:rPr>
-        <w:t>File Word (.docx); sơ đồ pipeline chèn dạng hình ảnh, mã Mermaid đặt ở phụ lục tài liệu.</w:t>
-      </w:r>
-    </w:p>
-    <w:p>
-      <w:r>
-        <w:br w:type="page"/>
-      </w:r>
-    </w:p>
-    <w:p>
-      <w:pPr>
-        <w:pStyle w:val="Heading1"/>
-        <w:keepNext/>
-      </w:pPr>
-      <w:r>
         <w:t>1. Thông tin đầu vào</w:t>
       </w:r>
     </w:p>
@@ -1531,24 +990,6 @@
       </w:r>
     </w:p>
     <w:p>
-      <w:pPr>
-        <w:spacing w:before="80" w:after="160"/>
-        <w:ind w:left="180" w:right="180"/>
-        <w:shd w:fill="FDEDEE"/>
-        <w:pBdr>
-          <w:left w:val="single" w:sz="18" w:space="6" w:color="DA2128"/>
-        </w:pBdr>
-      </w:pPr>
-      <w:r>
-        <w:rPr>
-          <w:rFonts w:ascii="Arial" w:hAnsi="Arial"/>
-          <w:b/>
-          <w:i w:val="0"/>
-          <w:color w:val="A71920"/>
-          <w:sz w:val="21"/>
-        </w:rPr>
-        <w:t xml:space="preserve">Yêu cầu từ prompt: </w:t>
-      </w:r>
       <w:r>
         <w:rPr>
           <w:rFonts w:ascii="Arial" w:hAnsi="Arial"/>
@@ -1573,18 +1014,6 @@
       </w:r>
     </w:p>
     <w:p>
-      <w:r>
-        <w:rPr>
-          <w:rFonts w:ascii="Arial" w:hAnsi="Arial"/>
-          <w:b w:val="0"/>
-          <w:i w:val="0"/>
-          <w:color w:val="25324A"/>
-          <w:sz w:val="21"/>
-        </w:rPr>
-        <w:t>Quyết định / open point: [ĐIỀN hoặc ghi Không áp dụng kèm lý do]</w:t>
-      </w:r>
-    </w:p>
-    <w:p>
       <w:pPr>
         <w:pStyle w:val="Heading2"/>
         <w:keepNext/>
@@ -1594,24 +1023,6 @@
       </w:r>
     </w:p>
     <w:p>
-      <w:pPr>
-        <w:spacing w:before="80" w:after="160"/>
-        <w:ind w:left="180" w:right="180"/>
-        <w:shd w:fill="FDEDEE"/>
-        <w:pBdr>
-          <w:left w:val="single" w:sz="18" w:space="6" w:color="DA2128"/>
-        </w:pBdr>
-      </w:pPr>
-      <w:r>
-        <w:rPr>
-          <w:rFonts w:ascii="Arial" w:hAnsi="Arial"/>
-          <w:b/>
-          <w:i w:val="0"/>
-          <w:color w:val="A71920"/>
-          <w:sz w:val="21"/>
-        </w:rPr>
-        <w:t xml:space="preserve">Yêu cầu từ prompt: </w:t>
-      </w:r>
       <w:r>
         <w:rPr>
           <w:rFonts w:ascii="Arial" w:hAnsi="Arial"/>
@@ -1636,18 +1047,6 @@
       </w:r>
     </w:p>
     <w:p>
-      <w:r>
-        <w:rPr>
-          <w:rFonts w:ascii="Arial" w:hAnsi="Arial"/>
-          <w:b w:val="0"/>
-          <w:i w:val="0"/>
-          <w:color w:val="25324A"/>
-          <w:sz w:val="21"/>
-        </w:rPr>
-        <w:t>Quyết định / open point: [ĐIỀN hoặc ghi Không áp dụng kèm lý do]</w:t>
-      </w:r>
-    </w:p>
-    <w:p>
       <w:pPr>
         <w:pStyle w:val="Heading2"/>
         <w:keepNext/>
@@ -1657,24 +1056,6 @@
       </w:r>
     </w:p>
     <w:p>
-      <w:pPr>
-        <w:spacing w:before="80" w:after="160"/>
-        <w:ind w:left="180" w:right="180"/>
-        <w:shd w:fill="FDEDEE"/>
-        <w:pBdr>
-          <w:left w:val="single" w:sz="18" w:space="6" w:color="DA2128"/>
-        </w:pBdr>
-      </w:pPr>
-      <w:r>
-        <w:rPr>
-          <w:rFonts w:ascii="Arial" w:hAnsi="Arial"/>
-          <w:b/>
-          <w:i w:val="0"/>
-          <w:color w:val="A71920"/>
-          <w:sz w:val="21"/>
-        </w:rPr>
-        <w:t xml:space="preserve">Yêu cầu từ prompt: </w:t>
-      </w:r>
       <w:r>
         <w:rPr>
           <w:rFonts w:ascii="Arial" w:hAnsi="Arial"/>
@@ -1699,18 +1080,6 @@
       </w:r>
     </w:p>
     <w:p>
-      <w:r>
-        <w:rPr>
-          <w:rFonts w:ascii="Arial" w:hAnsi="Arial"/>
-          <w:b w:val="0"/>
-          <w:i w:val="0"/>
-          <w:color w:val="25324A"/>
-          <w:sz w:val="21"/>
-        </w:rPr>
-        <w:t>Quyết định / open point: [ĐIỀN hoặc ghi Không áp dụng kèm lý do]</w:t>
-      </w:r>
-    </w:p>
-    <w:p>
       <w:pPr>
         <w:pStyle w:val="Heading2"/>
         <w:keepNext/>
@@ -1720,24 +1089,6 @@
       </w:r>
     </w:p>
     <w:p>
-      <w:pPr>
-        <w:spacing w:before="80" w:after="160"/>
-        <w:ind w:left="180" w:right="180"/>
-        <w:shd w:fill="FDEDEE"/>
-        <w:pBdr>
-          <w:left w:val="single" w:sz="18" w:space="6" w:color="DA2128"/>
-        </w:pBdr>
-      </w:pPr>
-      <w:r>
-        <w:rPr>
-          <w:rFonts w:ascii="Arial" w:hAnsi="Arial"/>
-          <w:b/>
-          <w:i w:val="0"/>
-          <w:color w:val="A71920"/>
-          <w:sz w:val="21"/>
-        </w:rPr>
-        <w:t xml:space="preserve">Yêu cầu từ prompt: </w:t>
-      </w:r>
       <w:r>
         <w:rPr>
           <w:rFonts w:ascii="Arial" w:hAnsi="Arial"/>
@@ -1762,18 +1113,6 @@
       </w:r>
     </w:p>
     <w:p>
-      <w:r>
-        <w:rPr>
-          <w:rFonts w:ascii="Arial" w:hAnsi="Arial"/>
-          <w:b w:val="0"/>
-          <w:i w:val="0"/>
-          <w:color w:val="25324A"/>
-          <w:sz w:val="21"/>
-        </w:rPr>
-        <w:t>Quyết định / open point: [ĐIỀN hoặc ghi Không áp dụng kèm lý do]</w:t>
-      </w:r>
-    </w:p>
-    <w:p>
       <w:pPr>
         <w:pStyle w:val="Heading2"/>
         <w:keepNext/>
@@ -1783,24 +1122,6 @@
       </w:r>
     </w:p>
     <w:p>
-      <w:pPr>
-        <w:spacing w:before="80" w:after="160"/>
-        <w:ind w:left="180" w:right="180"/>
-        <w:shd w:fill="FDEDEE"/>
-        <w:pBdr>
-          <w:left w:val="single" w:sz="18" w:space="6" w:color="DA2128"/>
-        </w:pBdr>
-      </w:pPr>
-      <w:r>
-        <w:rPr>
-          <w:rFonts w:ascii="Arial" w:hAnsi="Arial"/>
-          <w:b/>
-          <w:i w:val="0"/>
-          <w:color w:val="A71920"/>
-          <w:sz w:val="21"/>
-        </w:rPr>
-        <w:t xml:space="preserve">Yêu cầu từ prompt: </w:t>
-      </w:r>
       <w:r>
         <w:rPr>
           <w:rFonts w:ascii="Arial" w:hAnsi="Arial"/>
@@ -1825,18 +1146,6 @@
       </w:r>
     </w:p>
     <w:p>
-      <w:r>
-        <w:rPr>
-          <w:rFonts w:ascii="Arial" w:hAnsi="Arial"/>
-          <w:b w:val="0"/>
-          <w:i w:val="0"/>
-          <w:color w:val="25324A"/>
-          <w:sz w:val="21"/>
-        </w:rPr>
-        <w:t>Quyết định / open point: [ĐIỀN hoặc ghi Không áp dụng kèm lý do]</w:t>
-      </w:r>
-    </w:p>
-    <w:p>
       <w:pPr>
         <w:pStyle w:val="Heading2"/>
         <w:keepNext/>
@@ -1846,24 +1155,6 @@
       </w:r>
     </w:p>
     <w:p>
-      <w:pPr>
-        <w:spacing w:before="80" w:after="160"/>
-        <w:ind w:left="180" w:right="180"/>
-        <w:shd w:fill="FDEDEE"/>
-        <w:pBdr>
-          <w:left w:val="single" w:sz="18" w:space="6" w:color="DA2128"/>
-        </w:pBdr>
-      </w:pPr>
-      <w:r>
-        <w:rPr>
-          <w:rFonts w:ascii="Arial" w:hAnsi="Arial"/>
-          <w:b/>
-          <w:i w:val="0"/>
-          <w:color w:val="A71920"/>
-          <w:sz w:val="21"/>
-        </w:rPr>
-        <w:t xml:space="preserve">Yêu cầu từ prompt: </w:t>
-      </w:r>
       <w:r>
         <w:rPr>
           <w:rFonts w:ascii="Arial" w:hAnsi="Arial"/>
@@ -1888,18 +1179,6 @@
       </w:r>
     </w:p>
     <w:p>
-      <w:r>
-        <w:rPr>
-          <w:rFonts w:ascii="Arial" w:hAnsi="Arial"/>
-          <w:b w:val="0"/>
-          <w:i w:val="0"/>
-          <w:color w:val="25324A"/>
-          <w:sz w:val="21"/>
-        </w:rPr>
-        <w:t>Quyết định / open point: [ĐIỀN hoặc ghi Không áp dụng kèm lý do]</w:t>
-      </w:r>
-    </w:p>
-    <w:p>
       <w:pPr>
         <w:pStyle w:val="Heading2"/>
         <w:keepNext/>
@@ -1909,24 +1188,6 @@
       </w:r>
     </w:p>
     <w:p>
-      <w:pPr>
-        <w:spacing w:before="80" w:after="160"/>
-        <w:ind w:left="180" w:right="180"/>
-        <w:shd w:fill="FDEDEE"/>
-        <w:pBdr>
-          <w:left w:val="single" w:sz="18" w:space="6" w:color="DA2128"/>
-        </w:pBdr>
-      </w:pPr>
-      <w:r>
-        <w:rPr>
-          <w:rFonts w:ascii="Arial" w:hAnsi="Arial"/>
-          <w:b/>
-          <w:i w:val="0"/>
-          <w:color w:val="A71920"/>
-          <w:sz w:val="21"/>
-        </w:rPr>
-        <w:t xml:space="preserve">Yêu cầu từ prompt: </w:t>
-      </w:r>
       <w:r>
         <w:rPr>
           <w:rFonts w:ascii="Arial" w:hAnsi="Arial"/>
@@ -1951,18 +1212,6 @@
       </w:r>
     </w:p>
     <w:p>
-      <w:r>
-        <w:rPr>
-          <w:rFonts w:ascii="Arial" w:hAnsi="Arial"/>
-          <w:b w:val="0"/>
-          <w:i w:val="0"/>
-          <w:color w:val="25324A"/>
-          <w:sz w:val="21"/>
-        </w:rPr>
-        <w:t>Quyết định / open point: [ĐIỀN hoặc ghi Không áp dụng kèm lý do]</w:t>
-      </w:r>
-    </w:p>
-    <w:p>
       <w:pPr>
         <w:pStyle w:val="Heading2"/>
         <w:keepNext/>
@@ -1972,24 +1221,6 @@
       </w:r>
     </w:p>
     <w:p>
-      <w:pPr>
-        <w:spacing w:before="80" w:after="160"/>
-        <w:ind w:left="180" w:right="180"/>
-        <w:shd w:fill="FDEDEE"/>
-        <w:pBdr>
-          <w:left w:val="single" w:sz="18" w:space="6" w:color="DA2128"/>
-        </w:pBdr>
-      </w:pPr>
-      <w:r>
-        <w:rPr>
-          <w:rFonts w:ascii="Arial" w:hAnsi="Arial"/>
-          <w:b/>
-          <w:i w:val="0"/>
-          <w:color w:val="A71920"/>
-          <w:sz w:val="21"/>
-        </w:rPr>
-        <w:t xml:space="preserve">Yêu cầu từ prompt: </w:t>
-      </w:r>
       <w:r>
         <w:rPr>
           <w:rFonts w:ascii="Arial" w:hAnsi="Arial"/>
@@ -2011,18 +1242,6 @@
           <w:sz w:val="21"/>
         </w:rPr>
         <w:t>[ĐIỀN: nội dung đã được PIC xác nhận, kèm nguồn hoặc minh chứng khi áp dụng]</w:t>
-      </w:r>
-    </w:p>
-    <w:p>
-      <w:r>
-        <w:rPr>
-          <w:rFonts w:ascii="Arial" w:hAnsi="Arial"/>
-          <w:b w:val="0"/>
-          <w:i w:val="0"/>
-          <w:color w:val="25324A"/>
-          <w:sz w:val="21"/>
-        </w:rPr>
-        <w:t>Quyết định / open point: [ĐIỀN hoặc ghi Không áp dụng kèm lý do]</w:t>
       </w:r>
     </w:p>
     <w:p>
@@ -3251,7 +2470,7 @@
         <w:keepNext/>
       </w:pPr>
       <w:r>
-        <w:t>4. Nguyên tắc chất lượng</w:t>
+        <w:t>4. Hướng dẫn chất lượng</w:t>
       </w:r>
     </w:p>
     <w:p>
@@ -3338,633 +2557,6 @@
         </w:rPr>
         <w:t>Không để lại secret thật; chỉ ghi tên biến và tham chiếu secret manager khi cần.</w:t>
       </w:r>
-    </w:p>
-    <w:p>
-      <w:pPr>
-        <w:pStyle w:val="Heading1"/>
-        <w:keepNext/>
-      </w:pPr>
-      <w:r>
-        <w:t>5. Review &amp; phê duyệt</w:t>
-      </w:r>
-    </w:p>
-    <w:p>
-      <w:pPr>
-        <w:spacing w:before="160" w:after="80"/>
-      </w:pPr>
-      <w:r>
-        <w:rPr>
-          <w:rFonts w:ascii="Arial" w:hAnsi="Arial"/>
-          <w:b/>
-          <w:i w:val="0"/>
-          <w:color w:val="A71920"/>
-          <w:sz w:val="22"/>
-        </w:rPr>
-        <w:t>Sign-off</w:t>
-      </w:r>
-    </w:p>
-    <w:tbl>
-      <w:tblPr>
-        <w:tblStyle w:val="TableGrid"/>
-        <w:tblW w:type="dxa" w:w="9026"/>
-        <w:jc w:val="left"/>
-        <w:tblLayout w:type="fixed"/>
-        <w:tblLook w:firstColumn="1" w:firstRow="1" w:lastColumn="0" w:lastRow="0" w:noHBand="0" w:noVBand="1" w:val="04A0"/>
-        <w:tblInd w:w="120" w:type="dxa"/>
-      </w:tblPr>
-      <w:tblGrid>
-        <w:gridCol w:w="1805"/>
-        <w:gridCol w:w="1805"/>
-        <w:gridCol w:w="1625"/>
-        <w:gridCol w:w="1264"/>
-        <w:gridCol w:w="2527"/>
-      </w:tblGrid>
-      <w:tr>
-        <w:trPr>
-          <w:tblHeader w:val="true"/>
-        </w:trPr>
-        <w:tc>
-          <w:tcPr>
-            <w:tcW w:type="dxa" w:w="1805"/>
-            <w:tcMar>
-              <w:top w:w="80" w:type="dxa"/>
-              <w:start w:w="120" w:type="dxa"/>
-              <w:bottom w:w="80" w:type="dxa"/>
-              <w:end w:w="120" w:type="dxa"/>
-            </w:tcMar>
-            <w:shd w:fill="DA2128"/>
-            <w:vAlign w:val="center"/>
-          </w:tcPr>
-          <w:p>
-            <w:pPr>
-              <w:spacing w:after="0" w:line="259" w:lineRule="auto"/>
-            </w:pPr>
-            <w:r/>
-            <w:r>
-              <w:rPr>
-                <w:rFonts w:ascii="Arial" w:hAnsi="Arial"/>
-                <w:b/>
-                <w:i w:val="0"/>
-                <w:color w:val="FFFFFF"/>
-                <w:sz w:val="17"/>
-              </w:rPr>
-              <w:t>Vai trò</w:t>
-            </w:r>
-          </w:p>
-        </w:tc>
-        <w:tc>
-          <w:tcPr>
-            <w:tcW w:type="dxa" w:w="1805"/>
-            <w:tcMar>
-              <w:top w:w="80" w:type="dxa"/>
-              <w:start w:w="120" w:type="dxa"/>
-              <w:bottom w:w="80" w:type="dxa"/>
-              <w:end w:w="120" w:type="dxa"/>
-            </w:tcMar>
-            <w:shd w:fill="DA2128"/>
-            <w:vAlign w:val="center"/>
-          </w:tcPr>
-          <w:p>
-            <w:pPr>
-              <w:spacing w:after="0" w:line="259" w:lineRule="auto"/>
-            </w:pPr>
-            <w:r/>
-            <w:r>
-              <w:rPr>
-                <w:rFonts w:ascii="Arial" w:hAnsi="Arial"/>
-                <w:b/>
-                <w:i w:val="0"/>
-                <w:color w:val="FFFFFF"/>
-                <w:sz w:val="17"/>
-              </w:rPr>
-              <w:t>Họ tên</w:t>
-            </w:r>
-          </w:p>
-        </w:tc>
-        <w:tc>
-          <w:tcPr>
-            <w:tcW w:type="dxa" w:w="1625"/>
-            <w:tcMar>
-              <w:top w:w="80" w:type="dxa"/>
-              <w:start w:w="120" w:type="dxa"/>
-              <w:bottom w:w="80" w:type="dxa"/>
-              <w:end w:w="120" w:type="dxa"/>
-            </w:tcMar>
-            <w:shd w:fill="DA2128"/>
-            <w:vAlign w:val="center"/>
-          </w:tcPr>
-          <w:p>
-            <w:pPr>
-              <w:spacing w:after="0" w:line="259" w:lineRule="auto"/>
-            </w:pPr>
-            <w:r/>
-            <w:r>
-              <w:rPr>
-                <w:rFonts w:ascii="Arial" w:hAnsi="Arial"/>
-                <w:b/>
-                <w:i w:val="0"/>
-                <w:color w:val="FFFFFF"/>
-                <w:sz w:val="17"/>
-              </w:rPr>
-              <w:t>Kết luận</w:t>
-            </w:r>
-          </w:p>
-        </w:tc>
-        <w:tc>
-          <w:tcPr>
-            <w:tcW w:type="dxa" w:w="1264"/>
-            <w:tcMar>
-              <w:top w:w="80" w:type="dxa"/>
-              <w:start w:w="120" w:type="dxa"/>
-              <w:bottom w:w="80" w:type="dxa"/>
-              <w:end w:w="120" w:type="dxa"/>
-            </w:tcMar>
-            <w:shd w:fill="DA2128"/>
-            <w:vAlign w:val="center"/>
-          </w:tcPr>
-          <w:p>
-            <w:pPr>
-              <w:spacing w:after="0" w:line="259" w:lineRule="auto"/>
-            </w:pPr>
-            <w:r/>
-            <w:r>
-              <w:rPr>
-                <w:rFonts w:ascii="Arial" w:hAnsi="Arial"/>
-                <w:b/>
-                <w:i w:val="0"/>
-                <w:color w:val="FFFFFF"/>
-                <w:sz w:val="17"/>
-              </w:rPr>
-              <w:t>Ngày</w:t>
-            </w:r>
-          </w:p>
-        </w:tc>
-        <w:tc>
-          <w:tcPr>
-            <w:tcW w:type="dxa" w:w="2527"/>
-            <w:tcMar>
-              <w:top w:w="80" w:type="dxa"/>
-              <w:start w:w="120" w:type="dxa"/>
-              <w:bottom w:w="80" w:type="dxa"/>
-              <w:end w:w="120" w:type="dxa"/>
-            </w:tcMar>
-            <w:shd w:fill="DA2128"/>
-            <w:vAlign w:val="center"/>
-          </w:tcPr>
-          <w:p>
-            <w:pPr>
-              <w:spacing w:after="0" w:line="259" w:lineRule="auto"/>
-            </w:pPr>
-            <w:r/>
-            <w:r>
-              <w:rPr>
-                <w:rFonts w:ascii="Arial" w:hAnsi="Arial"/>
-                <w:b/>
-                <w:i w:val="0"/>
-                <w:color w:val="FFFFFF"/>
-                <w:sz w:val="17"/>
-              </w:rPr>
-              <w:t>Điều kiện / Ghi chú</w:t>
-            </w:r>
-          </w:p>
-        </w:tc>
-      </w:tr>
-      <w:tr>
-        <w:tc>
-          <w:tcPr>
-            <w:tcW w:type="dxa" w:w="1805"/>
-            <w:tcMar>
-              <w:top w:w="80" w:type="dxa"/>
-              <w:start w:w="120" w:type="dxa"/>
-              <w:bottom w:w="80" w:type="dxa"/>
-              <w:end w:w="120" w:type="dxa"/>
-            </w:tcMar>
-            <w:vAlign w:val="center"/>
-          </w:tcPr>
-          <w:p>
-            <w:pPr>
-              <w:spacing w:after="0" w:line="259" w:lineRule="auto"/>
-            </w:pPr>
-            <w:r/>
-            <w:r>
-              <w:rPr>
-                <w:rFonts w:ascii="Arial" w:hAnsi="Arial"/>
-                <w:b w:val="0"/>
-                <w:i w:val="0"/>
-                <w:color w:val="667085"/>
-                <w:sz w:val="17"/>
-              </w:rPr>
-              <w:t>[ĐIỀN 1]</w:t>
-            </w:r>
-          </w:p>
-        </w:tc>
-        <w:tc>
-          <w:tcPr>
-            <w:tcW w:type="dxa" w:w="1805"/>
-            <w:tcMar>
-              <w:top w:w="80" w:type="dxa"/>
-              <w:start w:w="120" w:type="dxa"/>
-              <w:bottom w:w="80" w:type="dxa"/>
-              <w:end w:w="120" w:type="dxa"/>
-            </w:tcMar>
-            <w:vAlign w:val="center"/>
-          </w:tcPr>
-          <w:p>
-            <w:pPr>
-              <w:spacing w:after="0" w:line="259" w:lineRule="auto"/>
-            </w:pPr>
-            <w:r/>
-            <w:r>
-              <w:rPr>
-                <w:rFonts w:ascii="Arial" w:hAnsi="Arial"/>
-                <w:b w:val="0"/>
-                <w:i w:val="0"/>
-                <w:color w:val="667085"/>
-                <w:sz w:val="17"/>
-              </w:rPr>
-              <w:t>[ĐIỀN]</w:t>
-            </w:r>
-          </w:p>
-        </w:tc>
-        <w:tc>
-          <w:tcPr>
-            <w:tcW w:type="dxa" w:w="1625"/>
-            <w:tcMar>
-              <w:top w:w="80" w:type="dxa"/>
-              <w:start w:w="120" w:type="dxa"/>
-              <w:bottom w:w="80" w:type="dxa"/>
-              <w:end w:w="120" w:type="dxa"/>
-            </w:tcMar>
-            <w:vAlign w:val="center"/>
-          </w:tcPr>
-          <w:p>
-            <w:pPr>
-              <w:spacing w:after="0" w:line="259" w:lineRule="auto"/>
-            </w:pPr>
-            <w:r/>
-            <w:r>
-              <w:rPr>
-                <w:rFonts w:ascii="Arial" w:hAnsi="Arial"/>
-                <w:b w:val="0"/>
-                <w:i w:val="0"/>
-                <w:color w:val="667085"/>
-                <w:sz w:val="17"/>
-              </w:rPr>
-              <w:t>[ĐIỀN]</w:t>
-            </w:r>
-          </w:p>
-        </w:tc>
-        <w:tc>
-          <w:tcPr>
-            <w:tcW w:type="dxa" w:w="1264"/>
-            <w:tcMar>
-              <w:top w:w="80" w:type="dxa"/>
-              <w:start w:w="120" w:type="dxa"/>
-              <w:bottom w:w="80" w:type="dxa"/>
-              <w:end w:w="120" w:type="dxa"/>
-            </w:tcMar>
-            <w:vAlign w:val="center"/>
-          </w:tcPr>
-          <w:p>
-            <w:pPr>
-              <w:spacing w:after="0" w:line="259" w:lineRule="auto"/>
-            </w:pPr>
-            <w:r/>
-            <w:r>
-              <w:rPr>
-                <w:rFonts w:ascii="Arial" w:hAnsi="Arial"/>
-                <w:b w:val="0"/>
-                <w:i w:val="0"/>
-                <w:color w:val="667085"/>
-                <w:sz w:val="17"/>
-              </w:rPr>
-              <w:t>[ĐIỀN]</w:t>
-            </w:r>
-          </w:p>
-        </w:tc>
-        <w:tc>
-          <w:tcPr>
-            <w:tcW w:type="dxa" w:w="2527"/>
-            <w:tcMar>
-              <w:top w:w="80" w:type="dxa"/>
-              <w:start w:w="120" w:type="dxa"/>
-              <w:bottom w:w="80" w:type="dxa"/>
-              <w:end w:w="120" w:type="dxa"/>
-            </w:tcMar>
-            <w:vAlign w:val="center"/>
-          </w:tcPr>
-          <w:p>
-            <w:pPr>
-              <w:spacing w:after="0" w:line="259" w:lineRule="auto"/>
-            </w:pPr>
-            <w:r/>
-            <w:r>
-              <w:rPr>
-                <w:rFonts w:ascii="Arial" w:hAnsi="Arial"/>
-                <w:b w:val="0"/>
-                <w:i w:val="0"/>
-                <w:color w:val="667085"/>
-                <w:sz w:val="17"/>
-              </w:rPr>
-              <w:t>[ĐIỀN]</w:t>
-            </w:r>
-          </w:p>
-        </w:tc>
-      </w:tr>
-      <w:tr>
-        <w:tc>
-          <w:tcPr>
-            <w:tcW w:type="dxa" w:w="1805"/>
-            <w:tcMar>
-              <w:top w:w="80" w:type="dxa"/>
-              <w:start w:w="120" w:type="dxa"/>
-              <w:bottom w:w="80" w:type="dxa"/>
-              <w:end w:w="120" w:type="dxa"/>
-            </w:tcMar>
-            <w:shd w:fill="F4F6F8"/>
-            <w:vAlign w:val="center"/>
-          </w:tcPr>
-          <w:p>
-            <w:pPr>
-              <w:spacing w:after="0" w:line="259" w:lineRule="auto"/>
-            </w:pPr>
-            <w:r/>
-            <w:r>
-              <w:rPr>
-                <w:rFonts w:ascii="Arial" w:hAnsi="Arial"/>
-                <w:b w:val="0"/>
-                <w:i w:val="0"/>
-                <w:color w:val="667085"/>
-                <w:sz w:val="17"/>
-              </w:rPr>
-              <w:t>[ĐIỀN 2]</w:t>
-            </w:r>
-          </w:p>
-        </w:tc>
-        <w:tc>
-          <w:tcPr>
-            <w:tcW w:type="dxa" w:w="1805"/>
-            <w:tcMar>
-              <w:top w:w="80" w:type="dxa"/>
-              <w:start w:w="120" w:type="dxa"/>
-              <w:bottom w:w="80" w:type="dxa"/>
-              <w:end w:w="120" w:type="dxa"/>
-            </w:tcMar>
-            <w:shd w:fill="F4F6F8"/>
-            <w:vAlign w:val="center"/>
-          </w:tcPr>
-          <w:p>
-            <w:pPr>
-              <w:spacing w:after="0" w:line="259" w:lineRule="auto"/>
-            </w:pPr>
-            <w:r/>
-            <w:r>
-              <w:rPr>
-                <w:rFonts w:ascii="Arial" w:hAnsi="Arial"/>
-                <w:b w:val="0"/>
-                <w:i w:val="0"/>
-                <w:color w:val="667085"/>
-                <w:sz w:val="17"/>
-              </w:rPr>
-              <w:t>[ĐIỀN]</w:t>
-            </w:r>
-          </w:p>
-        </w:tc>
-        <w:tc>
-          <w:tcPr>
-            <w:tcW w:type="dxa" w:w="1625"/>
-            <w:tcMar>
-              <w:top w:w="80" w:type="dxa"/>
-              <w:start w:w="120" w:type="dxa"/>
-              <w:bottom w:w="80" w:type="dxa"/>
-              <w:end w:w="120" w:type="dxa"/>
-            </w:tcMar>
-            <w:shd w:fill="F4F6F8"/>
-            <w:vAlign w:val="center"/>
-          </w:tcPr>
-          <w:p>
-            <w:pPr>
-              <w:spacing w:after="0" w:line="259" w:lineRule="auto"/>
-            </w:pPr>
-            <w:r/>
-            <w:r>
-              <w:rPr>
-                <w:rFonts w:ascii="Arial" w:hAnsi="Arial"/>
-                <w:b w:val="0"/>
-                <w:i w:val="0"/>
-                <w:color w:val="667085"/>
-                <w:sz w:val="17"/>
-              </w:rPr>
-              <w:t>[ĐIỀN]</w:t>
-            </w:r>
-          </w:p>
-        </w:tc>
-        <w:tc>
-          <w:tcPr>
-            <w:tcW w:type="dxa" w:w="1264"/>
-            <w:tcMar>
-              <w:top w:w="80" w:type="dxa"/>
-              <w:start w:w="120" w:type="dxa"/>
-              <w:bottom w:w="80" w:type="dxa"/>
-              <w:end w:w="120" w:type="dxa"/>
-            </w:tcMar>
-            <w:shd w:fill="F4F6F8"/>
-            <w:vAlign w:val="center"/>
-          </w:tcPr>
-          <w:p>
-            <w:pPr>
-              <w:spacing w:after="0" w:line="259" w:lineRule="auto"/>
-            </w:pPr>
-            <w:r/>
-            <w:r>
-              <w:rPr>
-                <w:rFonts w:ascii="Arial" w:hAnsi="Arial"/>
-                <w:b w:val="0"/>
-                <w:i w:val="0"/>
-                <w:color w:val="667085"/>
-                <w:sz w:val="17"/>
-              </w:rPr>
-              <w:t>[ĐIỀN]</w:t>
-            </w:r>
-          </w:p>
-        </w:tc>
-        <w:tc>
-          <w:tcPr>
-            <w:tcW w:type="dxa" w:w="2527"/>
-            <w:tcMar>
-              <w:top w:w="80" w:type="dxa"/>
-              <w:start w:w="120" w:type="dxa"/>
-              <w:bottom w:w="80" w:type="dxa"/>
-              <w:end w:w="120" w:type="dxa"/>
-            </w:tcMar>
-            <w:shd w:fill="F4F6F8"/>
-            <w:vAlign w:val="center"/>
-          </w:tcPr>
-          <w:p>
-            <w:pPr>
-              <w:spacing w:after="0" w:line="259" w:lineRule="auto"/>
-            </w:pPr>
-            <w:r/>
-            <w:r>
-              <w:rPr>
-                <w:rFonts w:ascii="Arial" w:hAnsi="Arial"/>
-                <w:b w:val="0"/>
-                <w:i w:val="0"/>
-                <w:color w:val="667085"/>
-                <w:sz w:val="17"/>
-              </w:rPr>
-              <w:t>[ĐIỀN]</w:t>
-            </w:r>
-          </w:p>
-        </w:tc>
-      </w:tr>
-      <w:tr>
-        <w:tc>
-          <w:tcPr>
-            <w:tcW w:type="dxa" w:w="1805"/>
-            <w:tcMar>
-              <w:top w:w="80" w:type="dxa"/>
-              <w:start w:w="120" w:type="dxa"/>
-              <w:bottom w:w="80" w:type="dxa"/>
-              <w:end w:w="120" w:type="dxa"/>
-            </w:tcMar>
-            <w:vAlign w:val="center"/>
-          </w:tcPr>
-          <w:p>
-            <w:pPr>
-              <w:spacing w:after="0" w:line="259" w:lineRule="auto"/>
-            </w:pPr>
-            <w:r/>
-            <w:r>
-              <w:rPr>
-                <w:rFonts w:ascii="Arial" w:hAnsi="Arial"/>
-                <w:b w:val="0"/>
-                <w:i w:val="0"/>
-                <w:color w:val="667085"/>
-                <w:sz w:val="17"/>
-              </w:rPr>
-              <w:t>[ĐIỀN 3]</w:t>
-            </w:r>
-          </w:p>
-        </w:tc>
-        <w:tc>
-          <w:tcPr>
-            <w:tcW w:type="dxa" w:w="1805"/>
-            <w:tcMar>
-              <w:top w:w="80" w:type="dxa"/>
-              <w:start w:w="120" w:type="dxa"/>
-              <w:bottom w:w="80" w:type="dxa"/>
-              <w:end w:w="120" w:type="dxa"/>
-            </w:tcMar>
-            <w:vAlign w:val="center"/>
-          </w:tcPr>
-          <w:p>
-            <w:pPr>
-              <w:spacing w:after="0" w:line="259" w:lineRule="auto"/>
-            </w:pPr>
-            <w:r/>
-            <w:r>
-              <w:rPr>
-                <w:rFonts w:ascii="Arial" w:hAnsi="Arial"/>
-                <w:b w:val="0"/>
-                <w:i w:val="0"/>
-                <w:color w:val="667085"/>
-                <w:sz w:val="17"/>
-              </w:rPr>
-              <w:t>[ĐIỀN]</w:t>
-            </w:r>
-          </w:p>
-        </w:tc>
-        <w:tc>
-          <w:tcPr>
-            <w:tcW w:type="dxa" w:w="1625"/>
-            <w:tcMar>
-              <w:top w:w="80" w:type="dxa"/>
-              <w:start w:w="120" w:type="dxa"/>
-              <w:bottom w:w="80" w:type="dxa"/>
-              <w:end w:w="120" w:type="dxa"/>
-            </w:tcMar>
-            <w:vAlign w:val="center"/>
-          </w:tcPr>
-          <w:p>
-            <w:pPr>
-              <w:spacing w:after="0" w:line="259" w:lineRule="auto"/>
-            </w:pPr>
-            <w:r/>
-            <w:r>
-              <w:rPr>
-                <w:rFonts w:ascii="Arial" w:hAnsi="Arial"/>
-                <w:b w:val="0"/>
-                <w:i w:val="0"/>
-                <w:color w:val="667085"/>
-                <w:sz w:val="17"/>
-              </w:rPr>
-              <w:t>[ĐIỀN]</w:t>
-            </w:r>
-          </w:p>
-        </w:tc>
-        <w:tc>
-          <w:tcPr>
-            <w:tcW w:type="dxa" w:w="1264"/>
-            <w:tcMar>
-              <w:top w:w="80" w:type="dxa"/>
-              <w:start w:w="120" w:type="dxa"/>
-              <w:bottom w:w="80" w:type="dxa"/>
-              <w:end w:w="120" w:type="dxa"/>
-            </w:tcMar>
-            <w:vAlign w:val="center"/>
-          </w:tcPr>
-          <w:p>
-            <w:pPr>
-              <w:spacing w:after="0" w:line="259" w:lineRule="auto"/>
-            </w:pPr>
-            <w:r/>
-            <w:r>
-              <w:rPr>
-                <w:rFonts w:ascii="Arial" w:hAnsi="Arial"/>
-                <w:b w:val="0"/>
-                <w:i w:val="0"/>
-                <w:color w:val="667085"/>
-                <w:sz w:val="17"/>
-              </w:rPr>
-              <w:t>[ĐIỀN]</w:t>
-            </w:r>
-          </w:p>
-        </w:tc>
-        <w:tc>
-          <w:tcPr>
-            <w:tcW w:type="dxa" w:w="2527"/>
-            <w:tcMar>
-              <w:top w:w="80" w:type="dxa"/>
-              <w:start w:w="120" w:type="dxa"/>
-              <w:bottom w:w="80" w:type="dxa"/>
-              <w:end w:w="120" w:type="dxa"/>
-            </w:tcMar>
-            <w:vAlign w:val="center"/>
-          </w:tcPr>
-          <w:p>
-            <w:pPr>
-              <w:spacing w:after="0" w:line="259" w:lineRule="auto"/>
-            </w:pPr>
-            <w:r/>
-            <w:r>
-              <w:rPr>
-                <w:rFonts w:ascii="Arial" w:hAnsi="Arial"/>
-                <w:b w:val="0"/>
-                <w:i w:val="0"/>
-                <w:color w:val="667085"/>
-                <w:sz w:val="17"/>
-              </w:rPr>
-              <w:t>[ĐIỀN]</w:t>
-            </w:r>
-          </w:p>
-        </w:tc>
-      </w:tr>
-    </w:tbl>
-    <w:p>
-      <w:pPr>
-        <w:spacing w:after="40"/>
-      </w:pPr>
     </w:p>
     <w:sectPr>
       <w:headerReference w:type="default" r:id="rId9"/>

</xml_diff>

<commit_message>
Publish handbook and exclude internal docs
</commit_message>
<xml_diff>
--- a/assets/templates/deployment/ci-cd-pipeline-documentation.docx
+++ b/assets/templates/deployment/ci-cd-pipeline-documentation.docx
@@ -414,7 +414,7 @@
                 <w:color w:val="25324A"/>
                 <w:sz w:val="19"/>
               </w:rPr>
-              <w:t>MẬT (CONFIDENTIAL) · Lưu hành nội bộ</w:t>
+              <w:t>CÔNG KHAI (PUBLIC) · Bản công khai</w:t>
             </w:r>
           </w:p>
         </w:tc>
@@ -2587,7 +2587,7 @@
         <w:color w:val="667085"/>
         <w:sz w:val="16"/>
       </w:rPr>
-      <w:t>MẬT (CONFIDENTIAL) · LƯU HÀNH NỘI BỘ</w:t>
+      <w:t>CÔNG KHAI (PUBLIC) · BẢN CÔNG KHAI</w:t>
     </w:r>
     <w:r>
       <w:rPr>

</xml_diff>

<commit_message>
Remove bank-specific context from public handbook
</commit_message>
<xml_diff>
--- a/assets/templates/deployment/ci-cd-pipeline-documentation.docx
+++ b/assets/templates/deployment/ci-cd-pipeline-documentation.docx
@@ -14,7 +14,7 @@
           <w:color w:val="DA2128"/>
           <w:sz w:val="20"/>
         </w:rPr>
-        <w:t>POWER HOME · DEPLOYMENT / DEVOPS</w:t>
+        <w:t>BP · DEPLOYMENT / DEVOPS</w:t>
       </w:r>
     </w:p>
     <w:p>
@@ -2627,7 +2627,7 @@
         <w:color w:val="DA2128"/>
         <w:sz w:val="17"/>
       </w:rPr>
-      <w:t xml:space="preserve">POWER HOME  </w:t>
+      <w:t xml:space="preserve">BP  </w:t>
     </w:r>
     <w:r>
       <w:rPr>

</xml_diff>